<commit_message>
docs(ai-media-education-dx): apply Padiem provider identity
Apply final provider identity 파디엠 (PADIEM) to the Business 35 customer package.

- Proposal: cover shows '제공: 파디엠'; all footers '파디엠 · DRAFT'; last page adds '제공 및 계약 주체: 파디엠' + pricing/legal-review closing
- One-page: '제공: 파디엠' in header, footer '파디엠 · DRAFT'
- Questionnaire: repeating page header '파디엠 · AI 업무전환 진단 질문지' + [N/3]
- Quote workbook: supplier/contracting/issuer = 파디엠; business details marked '발송 전 공식 사업자 정보 입력 필요' (no invented numbers)
- Meeting script / emails: Padiem self-intro, sender '파디엠 · AI 업무전환 프로그램'
- Internal docs (README/CHECKLIST/SOURCE_MAPPING/VISUAL_QA/REFERENCE_COMPARISON): FINAL_IDENTITY_DECIDED · PROVIDER 파디엠 · CONTRACTING_ENTITY 파디엠 · BUSINESS_DETAILS_VERIFICATION_PENDING
- Pricing/product scope unchanged (A/B1/B2/C)
- AI Revenue Lab not shown as contracting entity

Validation: ALL CHECKS PASSED; git diff --check clean; PDF 10/1/3; renders 14; XLSX 9 sheets.

Refs #359.
</commit_message>
<xml_diff>
--- a/docs/commercial/business-35-ai-media-education-dx/customer-package/Business35_Diagnostic_Questionnaire.docx
+++ b/docs/commercial/business-35-ai-media-education-dx/customer-package/Business35_Diagnostic_Questionnaire.docx
@@ -39,6 +39,15 @@
       <w:pPr>
         <w:spacing w:after="160"/>
       </w:pPr>
+      <w:r>
+        <w:rPr>
+          <w:rFonts w:ascii="Malgun Gothic" w:hAnsi="Malgun Gothic"/>
+          <w:b/>
+          <w:color w:val="1F3A5F"/>
+          <w:sz w:val="20"/>
+        </w:rPr>
+        <w:t xml:space="preserve">파디엠 · AI 업무전환 진단 질문지   </w:t>
+      </w:r>
       <w:r>
         <w:rPr>
           <w:rFonts w:ascii="Malgun Gothic" w:hAnsi="Malgun Gothic"/>
@@ -134,6 +143,15 @@
       <w:pPr>
         <w:spacing w:after="160"/>
       </w:pPr>
+      <w:r>
+        <w:rPr>
+          <w:rFonts w:ascii="Malgun Gothic" w:hAnsi="Malgun Gothic"/>
+          <w:b/>
+          <w:color w:val="1F3A5F"/>
+          <w:sz w:val="20"/>
+        </w:rPr>
+        <w:t xml:space="preserve">파디엠 · AI 업무전환 진단 질문지   </w:t>
+      </w:r>
       <w:r>
         <w:rPr>
           <w:rFonts w:ascii="Malgun Gothic" w:hAnsi="Malgun Gothic"/>
@@ -255,6 +273,15 @@
           <w:rFonts w:ascii="Malgun Gothic" w:hAnsi="Malgun Gothic"/>
           <w:b/>
           <w:color w:val="1F3A5F"/>
+          <w:sz w:val="20"/>
+        </w:rPr>
+        <w:t xml:space="preserve">파디엠 · AI 업무전환 진단 질문지   </w:t>
+      </w:r>
+      <w:r>
+        <w:rPr>
+          <w:rFonts w:ascii="Malgun Gothic" w:hAnsi="Malgun Gothic"/>
+          <w:b/>
+          <w:color w:val="1F3A5F"/>
           <w:sz w:val="24"/>
         </w:rPr>
         <w:t xml:space="preserve">3. 소요시간   </w:t>
@@ -353,6 +380,15 @@
       <w:pPr>
         <w:spacing w:after="160"/>
       </w:pPr>
+      <w:r>
+        <w:rPr>
+          <w:rFonts w:ascii="Malgun Gothic" w:hAnsi="Malgun Gothic"/>
+          <w:b/>
+          <w:color w:val="1F3A5F"/>
+          <w:sz w:val="20"/>
+        </w:rPr>
+        <w:t xml:space="preserve">파디엠 · AI 업무전환 진단 질문지   </w:t>
+      </w:r>
       <w:r>
         <w:rPr>
           <w:rFonts w:ascii="Malgun Gothic" w:hAnsi="Malgun Gothic"/>
@@ -460,6 +496,15 @@
           <w:rFonts w:ascii="Malgun Gothic" w:hAnsi="Malgun Gothic"/>
           <w:b/>
           <w:color w:val="1F3A5F"/>
+          <w:sz w:val="20"/>
+        </w:rPr>
+        <w:t xml:space="preserve">파디엠 · AI 업무전환 진단 질문지   </w:t>
+      </w:r>
+      <w:r>
+        <w:rPr>
+          <w:rFonts w:ascii="Malgun Gothic" w:hAnsi="Malgun Gothic"/>
+          <w:b/>
+          <w:color w:val="1F3A5F"/>
           <w:sz w:val="24"/>
         </w:rPr>
         <w:t xml:space="preserve">5. AI 사용 현황   </w:t>
@@ -555,6 +600,15 @@
           <w:rFonts w:ascii="Malgun Gothic" w:hAnsi="Malgun Gothic"/>
           <w:b/>
           <w:color w:val="1F3A5F"/>
+          <w:sz w:val="20"/>
+        </w:rPr>
+        <w:t xml:space="preserve">파디엠 · AI 업무전환 진단 질문지   </w:t>
+      </w:r>
+      <w:r>
+        <w:rPr>
+          <w:rFonts w:ascii="Malgun Gothic" w:hAnsi="Malgun Gothic"/>
+          <w:b/>
+          <w:color w:val="1F3A5F"/>
           <w:sz w:val="24"/>
         </w:rPr>
         <w:t xml:space="preserve">6. 입력 금지 자료   </w:t>
@@ -621,6 +675,15 @@
           <w:rFonts w:ascii="Malgun Gothic" w:hAnsi="Malgun Gothic"/>
           <w:b/>
           <w:color w:val="1F3A5F"/>
+          <w:sz w:val="20"/>
+        </w:rPr>
+        <w:t xml:space="preserve">파디엠 · AI 업무전환 진단 질문지   </w:t>
+      </w:r>
+      <w:r>
+        <w:rPr>
+          <w:rFonts w:ascii="Malgun Gothic" w:hAnsi="Malgun Gothic"/>
+          <w:b/>
+          <w:color w:val="1F3A5F"/>
           <w:sz w:val="24"/>
         </w:rPr>
         <w:t xml:space="preserve">7. 개인정보   </w:t>
@@ -674,6 +737,15 @@
       <w:pPr>
         <w:spacing w:after="160"/>
       </w:pPr>
+      <w:r>
+        <w:rPr>
+          <w:rFonts w:ascii="Malgun Gothic" w:hAnsi="Malgun Gothic"/>
+          <w:b/>
+          <w:color w:val="1F3A5F"/>
+          <w:sz w:val="20"/>
+        </w:rPr>
+        <w:t xml:space="preserve">파디엠 · AI 업무전환 진단 질문지   </w:t>
+      </w:r>
       <w:r>
         <w:rPr>
           <w:rFonts w:ascii="Malgun Gothic" w:hAnsi="Malgun Gothic"/>
@@ -737,6 +809,15 @@
           <w:rFonts w:ascii="Malgun Gothic" w:hAnsi="Malgun Gothic"/>
           <w:b/>
           <w:color w:val="1F3A5F"/>
+          <w:sz w:val="20"/>
+        </w:rPr>
+        <w:t xml:space="preserve">파디엠 · AI 업무전환 진단 질문지   </w:t>
+      </w:r>
+      <w:r>
+        <w:rPr>
+          <w:rFonts w:ascii="Malgun Gothic" w:hAnsi="Malgun Gothic"/>
+          <w:b/>
+          <w:color w:val="1F3A5F"/>
           <w:sz w:val="24"/>
         </w:rPr>
         <w:t xml:space="preserve">9. 승인 책임자   </w:t>
@@ -791,6 +872,15 @@
       <w:pPr>
         <w:spacing w:after="160"/>
       </w:pPr>
+      <w:r>
+        <w:rPr>
+          <w:rFonts w:ascii="Malgun Gothic" w:hAnsi="Malgun Gothic"/>
+          <w:b/>
+          <w:color w:val="1F3A5F"/>
+          <w:sz w:val="20"/>
+        </w:rPr>
+        <w:t xml:space="preserve">파디엠 · AI 업무전환 진단 질문지   </w:t>
+      </w:r>
       <w:r>
         <w:rPr>
           <w:rFonts w:ascii="Malgun Gothic" w:hAnsi="Malgun Gothic"/>
@@ -857,6 +947,15 @@
       <w:pPr>
         <w:spacing w:after="160"/>
       </w:pPr>
+      <w:r>
+        <w:rPr>
+          <w:rFonts w:ascii="Malgun Gothic" w:hAnsi="Malgun Gothic"/>
+          <w:b/>
+          <w:color w:val="1F3A5F"/>
+          <w:sz w:val="20"/>
+        </w:rPr>
+        <w:t xml:space="preserve">파디엠 · AI 업무전환 진단 질문지   </w:t>
+      </w:r>
       <w:r>
         <w:rPr>
           <w:rFonts w:ascii="Malgun Gothic" w:hAnsi="Malgun Gothic"/>
@@ -957,6 +1056,15 @@
           <w:rFonts w:ascii="Malgun Gothic" w:hAnsi="Malgun Gothic"/>
           <w:b/>
           <w:color w:val="1F3A5F"/>
+          <w:sz w:val="20"/>
+        </w:rPr>
+        <w:t xml:space="preserve">파디엠 · AI 업무전환 진단 질문지   </w:t>
+      </w:r>
+      <w:r>
+        <w:rPr>
+          <w:rFonts w:ascii="Malgun Gothic" w:hAnsi="Malgun Gothic"/>
+          <w:b/>
+          <w:color w:val="1F3A5F"/>
           <w:sz w:val="24"/>
         </w:rPr>
         <w:t xml:space="preserve">12. 성공 기준   </w:t>
@@ -1018,6 +1126,15 @@
       <w:pPr>
         <w:spacing w:after="160"/>
       </w:pPr>
+      <w:r>
+        <w:rPr>
+          <w:rFonts w:ascii="Malgun Gothic" w:hAnsi="Malgun Gothic"/>
+          <w:b/>
+          <w:color w:val="1F3A5F"/>
+          <w:sz w:val="20"/>
+        </w:rPr>
+        <w:t xml:space="preserve">파디엠 · AI 업무전환 진단 질문지   </w:t>
+      </w:r>
       <w:r>
         <w:rPr>
           <w:rFonts w:ascii="Malgun Gothic" w:hAnsi="Malgun Gothic"/>

</xml_diff>

<commit_message>
feat(b35): real-engine export/render regeneration of Lane B final artifacts
Artifacts generated with GENERATOR_REVISION
8c0c452625f11c934ff8158f0193865925c3db2d from exact accepted source
63adbefcf24a91a5a064c6b8e13779e151ba7de7 (CENTRAL G2 R1/R2, PR #1551).

- proposal/one-page PDFs: real Microsoft PowerPoint COM export from the
  editable 16:9 PPTX (aspect parity verified); questionnaire PDF: real
  Microsoft Word COM export (3 pages); fpdf-style fallback removed
- xlsx-rendered PNGs: real Microsoft Excel COM sheet export rasterized
  per sheet (9/9 pages); Pillow-table recreation removed
- GENERATION_MANIFEST.json/.md: exact SOURCE/PRODUCT/GENERATOR trace +
  DOCUMENT_EXPORTER / XLSX_EXPORTER / REAL_* PASS + producer/sha provenance
- DOCX pagination fit only (wording identical); PPTX/XLSX sources byte-identical
- validate_customer_package.py: ALL CHECKS PASSED; OUTPUT_HASHES repeatable

Refs #1504 #1551
</commit_message>
<xml_diff>
--- a/docs/commercial/business-35-ai-media-education-dx/customer-package/Business35_Diagnostic_Questionnaire.docx
+++ b/docs/commercial/business-35-ai-media-education-dx/customer-package/Business35_Diagnostic_Questionnaire.docx
@@ -10,41 +10,47 @@
         <w:rPr>
           <w:rFonts w:ascii="Malgun Gothic" w:hAnsi="Malgun Gothic"/>
           <w:color w:val="1F3A5F"/>
-          <w:sz w:val="36"/>
+          <w:sz w:val="30"/>
         </w:rPr>
         <w:t>Business 35 · 파디엠 AI 미디어 업무전환 스튜디오</w:t>
       </w:r>
     </w:p>
     <w:p>
+      <w:pPr>
+        <w:spacing w:after="40" w:before="0" w:line="240" w:lineRule="auto"/>
+      </w:pPr>
       <w:r>
         <w:rPr>
           <w:b/>
           <w:color w:val="1F3A5F"/>
-          <w:sz w:val="24"/>
+          <w:sz w:val="21"/>
         </w:rPr>
         <w:t>고객 진단 질문지 · V3.1 다섯 가지 입력 + 흐름·거버넌스 확인</w:t>
       </w:r>
     </w:p>
     <w:p>
+      <w:pPr>
+        <w:spacing w:after="40" w:before="0" w:line="240" w:lineRule="auto"/>
+      </w:pPr>
       <w:r>
         <w:rPr>
           <w:rFonts w:ascii="Malgun Gothic" w:hAnsi="Malgun Gothic"/>
           <w:color w:val="555A60"/>
-          <w:sz w:val="18"/>
+          <w:sz w:val="16"/>
         </w:rPr>
         <w:t>V3.1 입력(Q1–Q5): 조직 유형 / 결과물 유형 / 병목 지점 / 현재 팀 규모 / AI 사용 상태. 본 질문지는 견적·일정 확정 전 진단 자료로만 사용됩니다. 실제 개인정보나 내부자료의 원문을 기입하지 마시고, 분류·포함 여부만 표시해 주세요.</w:t>
       </w:r>
     </w:p>
     <w:p>
       <w:pPr>
-        <w:spacing w:after="160"/>
+        <w:spacing w:after="80" w:before="0" w:line="240" w:lineRule="auto"/>
       </w:pPr>
       <w:r>
         <w:rPr>
           <w:rFonts w:ascii="Malgun Gothic" w:hAnsi="Malgun Gothic"/>
           <w:b/>
           <w:color w:val="1F3A5F"/>
-          <w:sz w:val="20"/>
+          <w:sz w:val="18"/>
         </w:rPr>
         <w:t xml:space="preserve">파디엠 · AI 업무전환 진단 질문지   </w:t>
       </w:r>
@@ -53,7 +59,7 @@
           <w:rFonts w:ascii="Malgun Gothic" w:hAnsi="Malgun Gothic"/>
           <w:b/>
           <w:color w:val="1F3A5F"/>
-          <w:sz w:val="24"/>
+          <w:sz w:val="21"/>
         </w:rPr>
         <w:t xml:space="preserve">Q1–Q5. V3.1 다섯 가지 입력 (필수)   </w:t>
       </w:r>
@@ -61,274 +67,301 @@
         <w:rPr>
           <w:rFonts w:ascii="Malgun Gothic" w:hAnsi="Malgun Gothic"/>
           <w:color w:val="555A60"/>
-          <w:sz w:val="18"/>
+          <w:sz w:val="16"/>
         </w:rPr>
         <w:t>[ 1 / 3 ]</w:t>
       </w:r>
     </w:p>
     <w:p>
+      <w:pPr>
+        <w:spacing w:after="40" w:before="0" w:line="240" w:lineRule="auto"/>
+      </w:pPr>
       <w:r>
         <w:rPr>
           <w:rFonts w:ascii="Malgun Gothic" w:hAnsi="Malgun Gothic"/>
           <w:b/>
-          <w:sz w:val="21"/>
+          <w:sz w:val="19"/>
         </w:rPr>
         <w:t>Q1. 조직 유형</w:t>
       </w:r>
     </w:p>
     <w:p>
       <w:pPr>
-        <w:spacing w:after="160"/>
+        <w:spacing w:after="40" w:before="0" w:line="240" w:lineRule="auto"/>
       </w:pPr>
       <w:r>
         <w:rPr>
           <w:rFonts w:ascii="Malgun Gothic" w:hAnsi="Malgun Gothic"/>
-          <w:sz w:val="21"/>
+          <w:sz w:val="19"/>
         </w:rPr>
         <w:t xml:space="preserve">  ☐  지역 문화기관    </w:t>
       </w:r>
       <w:r>
         <w:rPr>
           <w:rFonts w:ascii="Malgun Gothic" w:hAnsi="Malgun Gothic"/>
-          <w:sz w:val="21"/>
+          <w:sz w:val="19"/>
         </w:rPr>
         <w:t xml:space="preserve">  ☐  지역 교육기관    </w:t>
       </w:r>
       <w:r>
         <w:rPr>
           <w:rFonts w:ascii="Malgun Gothic" w:hAnsi="Malgun Gothic"/>
-          <w:sz w:val="21"/>
+          <w:sz w:val="19"/>
         </w:rPr>
         <w:t xml:space="preserve">  ☐  지역 협회·단체    </w:t>
       </w:r>
       <w:r>
         <w:rPr>
           <w:rFonts w:ascii="Malgun Gothic" w:hAnsi="Malgun Gothic"/>
-          <w:sz w:val="21"/>
+          <w:sz w:val="19"/>
         </w:rPr>
         <w:t xml:space="preserve">  ☐  지역 미디어·콘텐츠 기관    </w:t>
       </w:r>
       <w:r>
         <w:rPr>
           <w:rFonts w:ascii="Malgun Gothic" w:hAnsi="Malgun Gothic"/>
-          <w:sz w:val="21"/>
+          <w:sz w:val="19"/>
         </w:rPr>
         <w:t xml:space="preserve">  ☐  기업 홍보·콘텐츠팀    </w:t>
       </w:r>
       <w:r>
         <w:rPr>
           <w:rFonts w:ascii="Malgun Gothic" w:hAnsi="Malgun Gothic"/>
-          <w:sz w:val="21"/>
+          <w:sz w:val="19"/>
         </w:rPr>
         <w:t xml:space="preserve">  ☐  기타    </w:t>
       </w:r>
     </w:p>
     <w:p>
+      <w:pPr>
+        <w:spacing w:after="40" w:before="0" w:line="240" w:lineRule="auto"/>
+      </w:pPr>
       <w:r>
         <w:rPr>
           <w:rFonts w:ascii="Malgun Gothic" w:hAnsi="Malgun Gothic"/>
           <w:b/>
-          <w:sz w:val="21"/>
+          <w:sz w:val="19"/>
         </w:rPr>
         <w:t>Q1-기타</w:t>
       </w:r>
     </w:p>
     <w:p>
+      <w:pPr>
+        <w:spacing w:after="40" w:before="0" w:line="240" w:lineRule="auto"/>
+      </w:pPr>
       <w:r>
         <w:rPr>
           <w:rFonts w:ascii="Malgun Gothic" w:hAnsi="Malgun Gothic"/>
           <w:color w:val="555A60"/>
-          <w:sz w:val="17"/>
+          <w:sz w:val="15"/>
         </w:rPr>
         <w:t>(기타인 경우 자유 기재 (조직명 약칭만, 실명·기밀 금지))</w:t>
       </w:r>
     </w:p>
     <w:p>
       <w:pPr>
-        <w:spacing w:after="160"/>
+        <w:spacing w:after="40" w:before="0" w:line="240" w:lineRule="auto"/>
       </w:pPr>
       <w:r>
         <w:rPr>
           <w:rFonts w:ascii="Malgun Gothic" w:hAnsi="Malgun Gothic"/>
-          <w:sz w:val="22"/>
+          <w:sz w:val="19"/>
         </w:rPr>
         <w:t>____________________________________________________________</w:t>
       </w:r>
     </w:p>
     <w:p>
+      <w:pPr>
+        <w:spacing w:after="40" w:before="0" w:line="240" w:lineRule="auto"/>
+      </w:pPr>
       <w:r>
         <w:rPr>
           <w:rFonts w:ascii="Malgun Gothic" w:hAnsi="Malgun Gothic"/>
           <w:b/>
-          <w:sz w:val="21"/>
+          <w:sz w:val="19"/>
         </w:rPr>
         <w:t>Q2. 결과물 유형</w:t>
       </w:r>
     </w:p>
     <w:p>
       <w:pPr>
-        <w:spacing w:after="160"/>
+        <w:spacing w:after="40" w:before="0" w:line="240" w:lineRule="auto"/>
       </w:pPr>
       <w:r>
         <w:rPr>
           <w:rFonts w:ascii="Malgun Gothic" w:hAnsi="Malgun Gothic"/>
-          <w:sz w:val="21"/>
+          <w:sz w:val="19"/>
         </w:rPr>
         <w:t xml:space="preserve">  ☐  홍보물    </w:t>
       </w:r>
       <w:r>
         <w:rPr>
           <w:rFonts w:ascii="Malgun Gothic" w:hAnsi="Malgun Gothic"/>
-          <w:sz w:val="21"/>
+          <w:sz w:val="19"/>
         </w:rPr>
         <w:t xml:space="preserve">  ☐  교육자료    </w:t>
       </w:r>
       <w:r>
         <w:rPr>
           <w:rFonts w:ascii="Malgun Gothic" w:hAnsi="Malgun Gothic"/>
-          <w:sz w:val="21"/>
+          <w:sz w:val="19"/>
         </w:rPr>
         <w:t xml:space="preserve">  ☐  영상·이미지    </w:t>
       </w:r>
       <w:r>
         <w:rPr>
           <w:rFonts w:ascii="Malgun Gothic" w:hAnsi="Malgun Gothic"/>
-          <w:sz w:val="21"/>
+          <w:sz w:val="19"/>
         </w:rPr>
         <w:t xml:space="preserve">  ☐  캠페인 콘텐츠    </w:t>
       </w:r>
       <w:r>
         <w:rPr>
           <w:rFonts w:ascii="Malgun Gothic" w:hAnsi="Malgun Gothic"/>
-          <w:sz w:val="21"/>
+          <w:sz w:val="19"/>
         </w:rPr>
         <w:t xml:space="preserve">  ☐  보도자료    </w:t>
       </w:r>
       <w:r>
         <w:rPr>
           <w:rFonts w:ascii="Malgun Gothic" w:hAnsi="Malgun Gothic"/>
-          <w:sz w:val="21"/>
+          <w:sz w:val="19"/>
         </w:rPr>
         <w:t xml:space="preserve">  ☐  기타    </w:t>
       </w:r>
     </w:p>
     <w:p>
+      <w:pPr>
+        <w:spacing w:after="40" w:before="0" w:line="240" w:lineRule="auto"/>
+      </w:pPr>
       <w:r>
         <w:rPr>
           <w:rFonts w:ascii="Malgun Gothic" w:hAnsi="Malgun Gothic"/>
           <w:b/>
-          <w:sz w:val="21"/>
+          <w:sz w:val="19"/>
         </w:rPr>
         <w:t>Q2-부</w:t>
       </w:r>
     </w:p>
     <w:p>
+      <w:pPr>
+        <w:spacing w:after="40" w:before="0" w:line="240" w:lineRule="auto"/>
+      </w:pPr>
       <w:r>
         <w:rPr>
           <w:rFonts w:ascii="Malgun Gothic" w:hAnsi="Malgun Gothic"/>
           <w:color w:val="555A60"/>
-          <w:sz w:val="17"/>
+          <w:sz w:val="15"/>
         </w:rPr>
         <w:t>(주 결과물 1개 + 부 결과물 목록 (원문 첨부 금지 — 유형만))</w:t>
       </w:r>
     </w:p>
     <w:p>
       <w:pPr>
-        <w:spacing w:after="160"/>
+        <w:spacing w:after="40" w:before="0" w:line="240" w:lineRule="auto"/>
       </w:pPr>
       <w:r>
         <w:rPr>
           <w:rFonts w:ascii="Malgun Gothic" w:hAnsi="Malgun Gothic"/>
-          <w:sz w:val="22"/>
+          <w:sz w:val="19"/>
         </w:rPr>
         <w:t>____________________________________________________________</w:t>
       </w:r>
     </w:p>
     <w:p>
+      <w:pPr>
+        <w:spacing w:after="40" w:before="0" w:line="240" w:lineRule="auto"/>
+      </w:pPr>
       <w:r>
         <w:rPr>
           <w:rFonts w:ascii="Malgun Gothic" w:hAnsi="Malgun Gothic"/>
           <w:b/>
-          <w:sz w:val="21"/>
+          <w:sz w:val="19"/>
         </w:rPr>
         <w:t>Q3. 병목 지점 (1–2개 선택 + 짧은 이유)</w:t>
       </w:r>
     </w:p>
     <w:p>
       <w:pPr>
-        <w:spacing w:after="160"/>
+        <w:spacing w:after="40" w:before="0" w:line="240" w:lineRule="auto"/>
       </w:pPr>
       <w:r>
         <w:rPr>
           <w:rFonts w:ascii="Malgun Gothic" w:hAnsi="Malgun Gothic"/>
-          <w:sz w:val="21"/>
+          <w:sz w:val="19"/>
         </w:rPr>
         <w:t xml:space="preserve">  ☐  기획    </w:t>
       </w:r>
       <w:r>
         <w:rPr>
           <w:rFonts w:ascii="Malgun Gothic" w:hAnsi="Malgun Gothic"/>
-          <w:sz w:val="21"/>
+          <w:sz w:val="19"/>
         </w:rPr>
         <w:t xml:space="preserve">  ☐  초안    </w:t>
       </w:r>
       <w:r>
         <w:rPr>
           <w:rFonts w:ascii="Malgun Gothic" w:hAnsi="Malgun Gothic"/>
-          <w:sz w:val="21"/>
+          <w:sz w:val="19"/>
         </w:rPr>
         <w:t xml:space="preserve">  ☐  제작    </w:t>
       </w:r>
       <w:r>
         <w:rPr>
           <w:rFonts w:ascii="Malgun Gothic" w:hAnsi="Malgun Gothic"/>
-          <w:sz w:val="21"/>
+          <w:sz w:val="19"/>
         </w:rPr>
         <w:t xml:space="preserve">  ☐  검토    </w:t>
       </w:r>
       <w:r>
         <w:rPr>
           <w:rFonts w:ascii="Malgun Gothic" w:hAnsi="Malgun Gothic"/>
-          <w:sz w:val="21"/>
+          <w:sz w:val="19"/>
         </w:rPr>
         <w:t xml:space="preserve">  ☐  승인    </w:t>
       </w:r>
       <w:r>
         <w:rPr>
           <w:rFonts w:ascii="Malgun Gothic" w:hAnsi="Malgun Gothic"/>
-          <w:sz w:val="21"/>
+          <w:sz w:val="19"/>
         </w:rPr>
         <w:t xml:space="preserve">  ☐  배포    </w:t>
       </w:r>
     </w:p>
     <w:p>
+      <w:pPr>
+        <w:spacing w:after="40" w:before="0" w:line="240" w:lineRule="auto"/>
+      </w:pPr>
       <w:r>
         <w:rPr>
           <w:rFonts w:ascii="Malgun Gothic" w:hAnsi="Malgun Gothic"/>
           <w:b/>
-          <w:sz w:val="21"/>
+          <w:sz w:val="19"/>
         </w:rPr>
         <w:t>Q3-이유</w:t>
       </w:r>
     </w:p>
     <w:p>
+      <w:pPr>
+        <w:spacing w:after="40" w:before="0" w:line="240" w:lineRule="auto"/>
+      </w:pPr>
       <w:r>
         <w:rPr>
           <w:rFonts w:ascii="Malgun Gothic" w:hAnsi="Malgun Gothic"/>
           <w:color w:val="555A60"/>
-          <w:sz w:val="17"/>
+          <w:sz w:val="15"/>
         </w:rPr>
         <w:t>(선택한 병목의 이유 (인물 비판 대신 프로세스 관점))</w:t>
       </w:r>
     </w:p>
     <w:p>
       <w:pPr>
-        <w:spacing w:after="160"/>
+        <w:spacing w:after="40" w:before="0" w:line="240" w:lineRule="auto"/>
       </w:pPr>
       <w:r>
         <w:rPr>
           <w:rFonts w:ascii="Malgun Gothic" w:hAnsi="Malgun Gothic"/>
-          <w:sz w:val="22"/>
+          <w:sz w:val="19"/>
         </w:rPr>
         <w:t>____________________________________________________________</w:t>
       </w:r>
@@ -340,14 +373,14 @@
     </w:p>
     <w:p>
       <w:pPr>
-        <w:spacing w:after="160"/>
+        <w:spacing w:after="80" w:before="0" w:line="240" w:lineRule="auto"/>
       </w:pPr>
       <w:r>
         <w:rPr>
           <w:rFonts w:ascii="Malgun Gothic" w:hAnsi="Malgun Gothic"/>
           <w:b/>
           <w:color w:val="1F3A5F"/>
-          <w:sz w:val="20"/>
+          <w:sz w:val="18"/>
         </w:rPr>
         <w:t xml:space="preserve">파디엠 · AI 업무전환 진단 질문지   </w:t>
       </w:r>
@@ -356,7 +389,7 @@
           <w:rFonts w:ascii="Malgun Gothic" w:hAnsi="Malgun Gothic"/>
           <w:b/>
           <w:color w:val="1F3A5F"/>
-          <w:sz w:val="24"/>
+          <w:sz w:val="21"/>
         </w:rPr>
         <w:t xml:space="preserve">Q4–Q5. 팀 규모·AI 상태 + Q6–Q9 흐름   </w:t>
       </w:r>
@@ -364,135 +397,150 @@
         <w:rPr>
           <w:rFonts w:ascii="Malgun Gothic" w:hAnsi="Malgun Gothic"/>
           <w:color w:val="555A60"/>
-          <w:sz w:val="18"/>
+          <w:sz w:val="16"/>
         </w:rPr>
         <w:t>[ 2 / 3 ]</w:t>
       </w:r>
     </w:p>
     <w:p>
+      <w:pPr>
+        <w:spacing w:after="40" w:before="0" w:line="240" w:lineRule="auto"/>
+      </w:pPr>
       <w:r>
         <w:rPr>
           <w:rFonts w:ascii="Malgun Gothic" w:hAnsi="Malgun Gothic"/>
           <w:b/>
-          <w:sz w:val="21"/>
+          <w:sz w:val="19"/>
         </w:rPr>
         <w:t>Q4. 현재 팀 규모</w:t>
       </w:r>
     </w:p>
     <w:p>
+      <w:pPr>
+        <w:spacing w:after="40" w:before="0" w:line="240" w:lineRule="auto"/>
+      </w:pPr>
       <w:r>
         <w:rPr>
           <w:rFonts w:ascii="Malgun Gothic" w:hAnsi="Malgun Gothic"/>
           <w:color w:val="555A60"/>
-          <w:sz w:val="17"/>
+          <w:sz w:val="15"/>
         </w:rPr>
         <w:t>(상시 담당 인원 수 + 역할별 구성 (예: 기획 1 / 제작 2 / 검토 1, 실명 대신 역할·인원만))</w:t>
       </w:r>
     </w:p>
     <w:p>
       <w:pPr>
-        <w:spacing w:after="160"/>
+        <w:spacing w:after="40" w:before="0" w:line="240" w:lineRule="auto"/>
       </w:pPr>
       <w:r>
         <w:rPr>
           <w:rFonts w:ascii="Malgun Gothic" w:hAnsi="Malgun Gothic"/>
-          <w:sz w:val="22"/>
+          <w:sz w:val="19"/>
         </w:rPr>
         <w:t>____________________________________________________________</w:t>
       </w:r>
     </w:p>
     <w:p>
+      <w:pPr>
+        <w:spacing w:after="40" w:before="0" w:line="240" w:lineRule="auto"/>
+      </w:pPr>
       <w:r>
         <w:rPr>
           <w:rFonts w:ascii="Malgun Gothic" w:hAnsi="Malgun Gothic"/>
           <w:b/>
-          <w:sz w:val="21"/>
+          <w:sz w:val="19"/>
         </w:rPr>
         <w:t>Q5. AI 사용 상태</w:t>
       </w:r>
     </w:p>
     <w:p>
       <w:pPr>
-        <w:spacing w:after="160"/>
+        <w:spacing w:after="40" w:before="0" w:line="240" w:lineRule="auto"/>
       </w:pPr>
       <w:r>
         <w:rPr>
           <w:rFonts w:ascii="Malgun Gothic" w:hAnsi="Malgun Gothic"/>
-          <w:sz w:val="21"/>
+          <w:sz w:val="19"/>
         </w:rPr>
         <w:t xml:space="preserve">  ☐  미사용    </w:t>
       </w:r>
       <w:r>
         <w:rPr>
           <w:rFonts w:ascii="Malgun Gothic" w:hAnsi="Malgun Gothic"/>
-          <w:sz w:val="21"/>
+          <w:sz w:val="19"/>
         </w:rPr>
         <w:t xml:space="preserve">  ☐  개인별 탐색    </w:t>
       </w:r>
       <w:r>
         <w:rPr>
           <w:rFonts w:ascii="Malgun Gothic" w:hAnsi="Malgun Gothic"/>
-          <w:sz w:val="21"/>
+          <w:sz w:val="19"/>
         </w:rPr>
         <w:t xml:space="preserve">  ☐  일부 업무 보조    </w:t>
       </w:r>
       <w:r>
         <w:rPr>
           <w:rFonts w:ascii="Malgun Gothic" w:hAnsi="Malgun Gothic"/>
-          <w:sz w:val="21"/>
+          <w:sz w:val="19"/>
         </w:rPr>
         <w:t xml:space="preserve">  ☐  승인 도구 운영 중    </w:t>
       </w:r>
       <w:r>
         <w:rPr>
           <w:rFonts w:ascii="Malgun Gothic" w:hAnsi="Malgun Gothic"/>
-          <w:sz w:val="21"/>
+          <w:sz w:val="19"/>
         </w:rPr>
         <w:t xml:space="preserve">  ☐  기타    </w:t>
       </w:r>
     </w:p>
     <w:p>
+      <w:pPr>
+        <w:spacing w:after="40" w:before="0" w:line="240" w:lineRule="auto"/>
+      </w:pPr>
       <w:r>
         <w:rPr>
           <w:rFonts w:ascii="Malgun Gothic" w:hAnsi="Malgun Gothic"/>
           <w:b/>
-          <w:sz w:val="21"/>
+          <w:sz w:val="19"/>
         </w:rPr>
         <w:t>Q5-도구</w:t>
       </w:r>
     </w:p>
     <w:p>
+      <w:pPr>
+        <w:spacing w:after="40" w:before="0" w:line="240" w:lineRule="auto"/>
+      </w:pPr>
       <w:r>
         <w:rPr>
           <w:rFonts w:ascii="Malgun Gothic" w:hAnsi="Malgun Gothic"/>
           <w:color w:val="555A60"/>
-          <w:sz w:val="17"/>
+          <w:sz w:val="15"/>
         </w:rPr>
         <w:t>(현재 사용 중인 승인/비승인 도구 간단 목록 (계정 정보 기재 금지))</w:t>
       </w:r>
     </w:p>
     <w:p>
       <w:pPr>
-        <w:spacing w:after="160"/>
+        <w:spacing w:after="40" w:before="0" w:line="240" w:lineRule="auto"/>
       </w:pPr>
       <w:r>
         <w:rPr>
           <w:rFonts w:ascii="Malgun Gothic" w:hAnsi="Malgun Gothic"/>
-          <w:sz w:val="22"/>
+          <w:sz w:val="19"/>
         </w:rPr>
         <w:t>____________________________________________________________</w:t>
       </w:r>
     </w:p>
     <w:p>
       <w:pPr>
-        <w:spacing w:after="160"/>
+        <w:spacing w:after="80" w:before="0" w:line="240" w:lineRule="auto"/>
       </w:pPr>
       <w:r>
         <w:rPr>
           <w:rFonts w:ascii="Malgun Gothic" w:hAnsi="Malgun Gothic"/>
           <w:b/>
           <w:color w:val="1F3A5F"/>
-          <w:sz w:val="20"/>
+          <w:sz w:val="18"/>
         </w:rPr>
         <w:t xml:space="preserve">파디엠 · AI 업무전환 진단 질문지   </w:t>
       </w:r>
@@ -501,7 +549,7 @@
           <w:rFonts w:ascii="Malgun Gothic" w:hAnsi="Malgun Gothic"/>
           <w:b/>
           <w:color w:val="1F3A5F"/>
-          <w:sz w:val="24"/>
+          <w:sz w:val="21"/>
         </w:rPr>
         <w:t xml:space="preserve">Q6–Q9. 흐름·기준선·검토·도구   </w:t>
       </w:r>
@@ -509,183 +557,207 @@
         <w:rPr>
           <w:rFonts w:ascii="Malgun Gothic" w:hAnsi="Malgun Gothic"/>
           <w:color w:val="555A60"/>
-          <w:sz w:val="18"/>
+          <w:sz w:val="16"/>
         </w:rPr>
         <w:t>[ 2 / 3 ]</w:t>
       </w:r>
     </w:p>
     <w:p>
+      <w:pPr>
+        <w:spacing w:after="40" w:before="0" w:line="240" w:lineRule="auto"/>
+      </w:pPr>
       <w:r>
         <w:rPr>
           <w:rFonts w:ascii="Malgun Gothic" w:hAnsi="Malgun Gothic"/>
           <w:b/>
-          <w:sz w:val="21"/>
+          <w:sz w:val="19"/>
         </w:rPr>
         <w:t>Q6. 현재 콘텐츠 제작 흐름</w:t>
       </w:r>
     </w:p>
     <w:p>
+      <w:pPr>
+        <w:spacing w:after="40" w:before="0" w:line="240" w:lineRule="auto"/>
+      </w:pPr>
       <w:r>
         <w:rPr>
           <w:rFonts w:ascii="Malgun Gothic" w:hAnsi="Malgun Gothic"/>
           <w:color w:val="555A60"/>
-          <w:sz w:val="17"/>
+          <w:sz w:val="15"/>
         </w:rPr>
         <w:t>(기획→초안→검토→승인→게시 순으로)</w:t>
       </w:r>
     </w:p>
     <w:p>
       <w:pPr>
-        <w:spacing w:after="160"/>
+        <w:spacing w:after="40" w:before="0" w:line="240" w:lineRule="auto"/>
       </w:pPr>
       <w:r>
         <w:rPr>
           <w:rFonts w:ascii="Malgun Gothic" w:hAnsi="Malgun Gothic"/>
-          <w:sz w:val="22"/>
+          <w:sz w:val="19"/>
         </w:rPr>
         <w:t>____________________________________________________________</w:t>
       </w:r>
     </w:p>
     <w:p>
       <w:pPr>
-        <w:spacing w:after="160"/>
+        <w:spacing w:after="40" w:before="0" w:line="240" w:lineRule="auto"/>
       </w:pPr>
       <w:r>
         <w:rPr>
           <w:rFonts w:ascii="Malgun Gothic" w:hAnsi="Malgun Gothic"/>
-          <w:sz w:val="22"/>
+          <w:sz w:val="19"/>
         </w:rPr>
         <w:t>____________________________________________________________</w:t>
       </w:r>
     </w:p>
     <w:p>
+      <w:pPr>
+        <w:spacing w:after="40" w:before="0" w:line="240" w:lineRule="auto"/>
+      </w:pPr>
       <w:r>
         <w:rPr>
           <w:rFonts w:ascii="Malgun Gothic" w:hAnsi="Malgun Gothic"/>
           <w:b/>
-          <w:sz w:val="21"/>
+          <w:sz w:val="19"/>
         </w:rPr>
         <w:t>Q7. 업무별 소요시간</w:t>
       </w:r>
     </w:p>
     <w:p>
+      <w:pPr>
+        <w:spacing w:after="40" w:before="0" w:line="240" w:lineRule="auto"/>
+      </w:pPr>
       <w:r>
         <w:rPr>
           <w:rFonts w:ascii="Malgun Gothic" w:hAnsi="Malgun Gothic"/>
           <w:color w:val="555A60"/>
-          <w:sz w:val="17"/>
+          <w:sz w:val="15"/>
         </w:rPr>
         <w:t>(콘텐츠 1건당 단계별 시간 표 (기준 생산시간))</w:t>
       </w:r>
     </w:p>
     <w:p>
       <w:pPr>
-        <w:spacing w:after="160"/>
+        <w:spacing w:after="40" w:before="0" w:line="240" w:lineRule="auto"/>
       </w:pPr>
       <w:r>
         <w:rPr>
           <w:rFonts w:ascii="Malgun Gothic" w:hAnsi="Malgun Gothic"/>
-          <w:sz w:val="22"/>
+          <w:sz w:val="19"/>
         </w:rPr>
         <w:t>____________________________________________________________</w:t>
       </w:r>
     </w:p>
     <w:p>
       <w:pPr>
-        <w:spacing w:after="160"/>
+        <w:spacing w:after="40" w:before="0" w:line="240" w:lineRule="auto"/>
       </w:pPr>
       <w:r>
         <w:rPr>
           <w:rFonts w:ascii="Malgun Gothic" w:hAnsi="Malgun Gothic"/>
-          <w:sz w:val="22"/>
+          <w:sz w:val="19"/>
         </w:rPr>
         <w:t>____________________________________________________________</w:t>
       </w:r>
     </w:p>
     <w:p>
+      <w:pPr>
+        <w:spacing w:after="40" w:before="0" w:line="240" w:lineRule="auto"/>
+      </w:pPr>
       <w:r>
         <w:rPr>
           <w:rFonts w:ascii="Malgun Gothic" w:hAnsi="Malgun Gothic"/>
           <w:b/>
-          <w:sz w:val="21"/>
+          <w:sz w:val="19"/>
         </w:rPr>
         <w:t>Q8. 검토·승인 단계</w:t>
       </w:r>
     </w:p>
     <w:p>
+      <w:pPr>
+        <w:spacing w:after="40" w:before="0" w:line="240" w:lineRule="auto"/>
+      </w:pPr>
       <w:r>
         <w:rPr>
           <w:rFonts w:ascii="Malgun Gothic" w:hAnsi="Malgun Gothic"/>
           <w:color w:val="555A60"/>
-          <w:sz w:val="17"/>
+          <w:sz w:val="15"/>
         </w:rPr>
         <w:t>(단계 목록 + 역할(직책만))</w:t>
       </w:r>
     </w:p>
     <w:p>
       <w:pPr>
-        <w:spacing w:after="160"/>
+        <w:spacing w:after="40" w:before="0" w:line="240" w:lineRule="auto"/>
       </w:pPr>
       <w:r>
         <w:rPr>
           <w:rFonts w:ascii="Malgun Gothic" w:hAnsi="Malgun Gothic"/>
-          <w:sz w:val="22"/>
+          <w:sz w:val="19"/>
         </w:rPr>
         <w:t>____________________________________________________________</w:t>
       </w:r>
     </w:p>
     <w:p>
       <w:pPr>
-        <w:spacing w:after="160"/>
+        <w:spacing w:after="40" w:before="0" w:line="240" w:lineRule="auto"/>
       </w:pPr>
       <w:r>
         <w:rPr>
           <w:rFonts w:ascii="Malgun Gothic" w:hAnsi="Malgun Gothic"/>
-          <w:sz w:val="22"/>
+          <w:sz w:val="19"/>
         </w:rPr>
         <w:t>____________________________________________________________</w:t>
       </w:r>
     </w:p>
     <w:p>
+      <w:pPr>
+        <w:spacing w:after="40" w:before="0" w:line="240" w:lineRule="auto"/>
+      </w:pPr>
       <w:r>
         <w:rPr>
           <w:rFonts w:ascii="Malgun Gothic" w:hAnsi="Malgun Gothic"/>
           <w:b/>
-          <w:sz w:val="21"/>
+          <w:sz w:val="19"/>
         </w:rPr>
         <w:t>Q9. 현재 사용하는 AI 도구 상세</w:t>
       </w:r>
     </w:p>
     <w:p>
+      <w:pPr>
+        <w:spacing w:after="40" w:before="0" w:line="240" w:lineRule="auto"/>
+      </w:pPr>
       <w:r>
         <w:rPr>
           <w:rFonts w:ascii="Malgun Gothic" w:hAnsi="Malgun Gothic"/>
           <w:color w:val="555A60"/>
-          <w:sz w:val="17"/>
+          <w:sz w:val="15"/>
         </w:rPr>
         <w:t>(Q5 요약과 별개로 도구별 상세 (도구명 + 용도 + 빈도))</w:t>
       </w:r>
     </w:p>
     <w:p>
       <w:pPr>
-        <w:spacing w:after="160"/>
+        <w:spacing w:after="40" w:before="0" w:line="240" w:lineRule="auto"/>
       </w:pPr>
       <w:r>
         <w:rPr>
           <w:rFonts w:ascii="Malgun Gothic" w:hAnsi="Malgun Gothic"/>
-          <w:sz w:val="22"/>
+          <w:sz w:val="19"/>
         </w:rPr>
         <w:t>____________________________________________________________</w:t>
       </w:r>
     </w:p>
     <w:p>
       <w:pPr>
-        <w:spacing w:after="160"/>
+        <w:spacing w:after="40" w:before="0" w:line="240" w:lineRule="auto"/>
       </w:pPr>
       <w:r>
         <w:rPr>
           <w:rFonts w:ascii="Malgun Gothic" w:hAnsi="Malgun Gothic"/>
-          <w:sz w:val="22"/>
+          <w:sz w:val="19"/>
         </w:rPr>
         <w:t>____________________________________________________________</w:t>
       </w:r>
@@ -697,14 +769,14 @@
     </w:p>
     <w:p>
       <w:pPr>
-        <w:spacing w:after="160"/>
+        <w:spacing w:after="80" w:before="0" w:line="240" w:lineRule="auto"/>
       </w:pPr>
       <w:r>
         <w:rPr>
           <w:rFonts w:ascii="Malgun Gothic" w:hAnsi="Malgun Gothic"/>
           <w:b/>
           <w:color w:val="1F3A5F"/>
-          <w:sz w:val="20"/>
+          <w:sz w:val="18"/>
         </w:rPr>
         <w:t xml:space="preserve">파디엠 · AI 업무전환 진단 질문지   </w:t>
       </w:r>
@@ -713,7 +785,7 @@
           <w:rFonts w:ascii="Malgun Gothic" w:hAnsi="Malgun Gothic"/>
           <w:b/>
           <w:color w:val="1F3A5F"/>
-          <w:sz w:val="24"/>
+          <w:sz w:val="21"/>
         </w:rPr>
         <w:t xml:space="preserve">Q10–Q17. 거버넌스·파일럿 준비   </w:t>
       </w:r>
@@ -721,321 +793,363 @@
         <w:rPr>
           <w:rFonts w:ascii="Malgun Gothic" w:hAnsi="Malgun Gothic"/>
           <w:color w:val="555A60"/>
-          <w:sz w:val="18"/>
+          <w:sz w:val="16"/>
         </w:rPr>
         <w:t>[ 3 / 3 ]</w:t>
       </w:r>
     </w:p>
     <w:p>
+      <w:pPr>
+        <w:spacing w:after="40" w:before="0" w:line="240" w:lineRule="auto"/>
+      </w:pPr>
       <w:r>
         <w:rPr>
           <w:rFonts w:ascii="Malgun Gothic" w:hAnsi="Malgun Gothic"/>
           <w:b/>
-          <w:sz w:val="21"/>
+          <w:sz w:val="19"/>
         </w:rPr>
         <w:t>Q10. 개인정보</w:t>
       </w:r>
     </w:p>
     <w:p>
       <w:pPr>
-        <w:spacing w:after="160"/>
+        <w:spacing w:after="40" w:before="0" w:line="240" w:lineRule="auto"/>
       </w:pPr>
       <w:r>
         <w:rPr>
           <w:rFonts w:ascii="Malgun Gothic" w:hAnsi="Malgun Gothic"/>
-          <w:sz w:val="21"/>
+          <w:sz w:val="19"/>
         </w:rPr>
         <w:t xml:space="preserve">  ☐  예    </w:t>
       </w:r>
       <w:r>
         <w:rPr>
           <w:rFonts w:ascii="Malgun Gothic" w:hAnsi="Malgun Gothic"/>
-          <w:sz w:val="21"/>
+          <w:sz w:val="19"/>
         </w:rPr>
         <w:t xml:space="preserve">  ☐  아니오    </w:t>
       </w:r>
       <w:r>
         <w:rPr>
           <w:rFonts w:ascii="Malgun Gothic" w:hAnsi="Malgun Gothic"/>
-          <w:sz w:val="21"/>
+          <w:sz w:val="19"/>
         </w:rPr>
         <w:t xml:space="preserve">  ☐  일부    </w:t>
       </w:r>
     </w:p>
     <w:p>
+      <w:pPr>
+        <w:spacing w:after="40" w:before="0" w:line="240" w:lineRule="auto"/>
+      </w:pPr>
       <w:r>
         <w:rPr>
           <w:rFonts w:ascii="Malgun Gothic" w:hAnsi="Malgun Gothic"/>
           <w:b/>
-          <w:sz w:val="21"/>
+          <w:sz w:val="19"/>
         </w:rPr>
         <w:t>Q11. 저작권 자료</w:t>
       </w:r>
     </w:p>
     <w:p>
       <w:pPr>
-        <w:spacing w:after="160"/>
+        <w:spacing w:after="40" w:before="0" w:line="240" w:lineRule="auto"/>
       </w:pPr>
       <w:r>
         <w:rPr>
           <w:rFonts w:ascii="Malgun Gothic" w:hAnsi="Malgun Gothic"/>
-          <w:sz w:val="21"/>
+          <w:sz w:val="19"/>
         </w:rPr>
         <w:t xml:space="preserve">  ☐  예    </w:t>
       </w:r>
       <w:r>
         <w:rPr>
           <w:rFonts w:ascii="Malgun Gothic" w:hAnsi="Malgun Gothic"/>
-          <w:sz w:val="21"/>
+          <w:sz w:val="19"/>
         </w:rPr>
         <w:t xml:space="preserve">  ☐  아니오    </w:t>
       </w:r>
       <w:r>
         <w:rPr>
           <w:rFonts w:ascii="Malgun Gothic" w:hAnsi="Malgun Gothic"/>
-          <w:sz w:val="21"/>
+          <w:sz w:val="19"/>
         </w:rPr>
         <w:t xml:space="preserve">  ☐  일부    </w:t>
       </w:r>
     </w:p>
     <w:p>
+      <w:pPr>
+        <w:spacing w:after="40" w:before="0" w:line="240" w:lineRule="auto"/>
+      </w:pPr>
       <w:r>
         <w:rPr>
           <w:rFonts w:ascii="Malgun Gothic" w:hAnsi="Malgun Gothic"/>
           <w:b/>
-          <w:sz w:val="21"/>
+          <w:sz w:val="19"/>
         </w:rPr>
         <w:t>Q12. 외부 공개 여부</w:t>
       </w:r>
     </w:p>
     <w:p>
+      <w:pPr>
+        <w:spacing w:after="40" w:before="0" w:line="240" w:lineRule="auto"/>
+      </w:pPr>
       <w:r>
         <w:rPr>
           <w:rFonts w:ascii="Malgun Gothic" w:hAnsi="Malgun Gothic"/>
           <w:color w:val="555A60"/>
-          <w:sz w:val="17"/>
+          <w:sz w:val="15"/>
         </w:rPr>
         <w:t>(외부에 공개되는 채널 목록 (웹·SNS·언론 배포 등))</w:t>
       </w:r>
     </w:p>
     <w:p>
       <w:pPr>
-        <w:spacing w:after="160"/>
+        <w:spacing w:after="40" w:before="0" w:line="240" w:lineRule="auto"/>
       </w:pPr>
       <w:r>
         <w:rPr>
           <w:rFonts w:ascii="Malgun Gothic" w:hAnsi="Malgun Gothic"/>
-          <w:sz w:val="22"/>
+          <w:sz w:val="19"/>
         </w:rPr>
         <w:t>____________________________________________________________</w:t>
       </w:r>
     </w:p>
     <w:p>
+      <w:pPr>
+        <w:spacing w:after="40" w:before="0" w:line="240" w:lineRule="auto"/>
+      </w:pPr>
       <w:r>
         <w:rPr>
           <w:rFonts w:ascii="Malgun Gothic" w:hAnsi="Malgun Gothic"/>
           <w:b/>
-          <w:sz w:val="21"/>
+          <w:sz w:val="19"/>
         </w:rPr>
         <w:t>Q13. 재작업·실패 유형</w:t>
       </w:r>
     </w:p>
     <w:p>
+      <w:pPr>
+        <w:spacing w:after="40" w:before="0" w:line="240" w:lineRule="auto"/>
+      </w:pPr>
       <w:r>
         <w:rPr>
           <w:rFonts w:ascii="Malgun Gothic" w:hAnsi="Malgun Gothic"/>
           <w:color w:val="555A60"/>
-          <w:sz w:val="17"/>
+          <w:sz w:val="15"/>
         </w:rPr>
         <w:t>(빈도 높은 순서 나열 (프로세스 관점))</w:t>
       </w:r>
     </w:p>
     <w:p>
       <w:pPr>
-        <w:spacing w:after="160"/>
+        <w:spacing w:after="40" w:before="0" w:line="240" w:lineRule="auto"/>
       </w:pPr>
       <w:r>
         <w:rPr>
           <w:rFonts w:ascii="Malgun Gothic" w:hAnsi="Malgun Gothic"/>
-          <w:sz w:val="22"/>
+          <w:sz w:val="19"/>
         </w:rPr>
         <w:t>____________________________________________________________</w:t>
       </w:r>
     </w:p>
     <w:p>
       <w:pPr>
-        <w:spacing w:after="160"/>
+        <w:spacing w:after="40" w:before="0" w:line="240" w:lineRule="auto"/>
       </w:pPr>
       <w:r>
         <w:rPr>
           <w:rFonts w:ascii="Malgun Gothic" w:hAnsi="Malgun Gothic"/>
-          <w:sz w:val="22"/>
+          <w:sz w:val="19"/>
         </w:rPr>
         <w:t>____________________________________________________________</w:t>
       </w:r>
     </w:p>
     <w:p>
+      <w:pPr>
+        <w:spacing w:after="40" w:before="0" w:line="240" w:lineRule="auto"/>
+      </w:pPr>
       <w:r>
         <w:rPr>
           <w:rFonts w:ascii="Malgun Gothic" w:hAnsi="Malgun Gothic"/>
           <w:b/>
-          <w:sz w:val="21"/>
+          <w:sz w:val="19"/>
         </w:rPr>
         <w:t>Q14. 과거 교육 경험 (선택)</w:t>
       </w:r>
     </w:p>
     <w:p>
       <w:pPr>
-        <w:spacing w:after="160"/>
+        <w:spacing w:after="40" w:before="0" w:line="240" w:lineRule="auto"/>
       </w:pPr>
       <w:r>
         <w:rPr>
           <w:rFonts w:ascii="Malgun Gothic" w:hAnsi="Malgun Gothic"/>
-          <w:sz w:val="21"/>
+          <w:sz w:val="19"/>
         </w:rPr>
         <w:t xml:space="preserve">  ☐  예</w:t>
       </w:r>
       <w:r>
         <w:rPr>
           <w:rFonts w:ascii="Malgun Gothic" w:hAnsi="Malgun Gothic"/>
-          <w:sz w:val="21"/>
+          <w:sz w:val="19"/>
         </w:rPr>
         <w:t xml:space="preserve">  ☐  아니오</w:t>
       </w:r>
     </w:p>
     <w:p>
+      <w:pPr>
+        <w:spacing w:after="40" w:before="0" w:line="240" w:lineRule="auto"/>
+      </w:pPr>
       <w:r>
         <w:rPr>
           <w:rFonts w:ascii="Malgun Gothic" w:hAnsi="Malgun Gothic"/>
           <w:b/>
-          <w:sz w:val="21"/>
+          <w:sz w:val="19"/>
         </w:rPr>
         <w:t>Q15. 금지 업무</w:t>
       </w:r>
     </w:p>
     <w:p>
+      <w:pPr>
+        <w:spacing w:after="40" w:before="0" w:line="240" w:lineRule="auto"/>
+      </w:pPr>
       <w:r>
         <w:rPr>
           <w:rFonts w:ascii="Malgun Gothic" w:hAnsi="Malgun Gothic"/>
           <w:color w:val="555A60"/>
-          <w:sz w:val="17"/>
+          <w:sz w:val="15"/>
         </w:rPr>
         <w:t>(AI를 절대 쓰면 안 되는 업무)</w:t>
       </w:r>
     </w:p>
     <w:p>
       <w:pPr>
-        <w:spacing w:after="160"/>
+        <w:spacing w:after="40" w:before="0" w:line="240" w:lineRule="auto"/>
       </w:pPr>
       <w:r>
         <w:rPr>
           <w:rFonts w:ascii="Malgun Gothic" w:hAnsi="Malgun Gothic"/>
-          <w:sz w:val="22"/>
+          <w:sz w:val="19"/>
         </w:rPr>
         <w:t>____________________________________________________________</w:t>
       </w:r>
     </w:p>
     <w:p>
       <w:pPr>
-        <w:spacing w:after="160"/>
+        <w:spacing w:after="40" w:before="0" w:line="240" w:lineRule="auto"/>
       </w:pPr>
       <w:r>
         <w:rPr>
           <w:rFonts w:ascii="Malgun Gothic" w:hAnsi="Malgun Gothic"/>
-          <w:sz w:val="22"/>
+          <w:sz w:val="19"/>
         </w:rPr>
         <w:t>____________________________________________________________</w:t>
       </w:r>
     </w:p>
     <w:p>
+      <w:pPr>
+        <w:spacing w:after="40" w:before="0" w:line="240" w:lineRule="auto"/>
+      </w:pPr>
       <w:r>
         <w:rPr>
           <w:rFonts w:ascii="Malgun Gothic" w:hAnsi="Malgun Gothic"/>
           <w:b/>
-          <w:sz w:val="21"/>
+          <w:sz w:val="19"/>
         </w:rPr>
         <w:t>Q16. 파일럿 담당자</w:t>
       </w:r>
     </w:p>
     <w:p>
+      <w:pPr>
+        <w:spacing w:after="40" w:before="0" w:line="240" w:lineRule="auto"/>
+      </w:pPr>
       <w:r>
         <w:rPr>
           <w:rFonts w:ascii="Malgun Gothic" w:hAnsi="Malgun Gothic"/>
           <w:color w:val="555A60"/>
-          <w:sz w:val="17"/>
+          <w:sz w:val="15"/>
         </w:rPr>
         <w:t>(1팀 6–10명 + 운영 책임자 1인 (역할·인원·주당 투입 시간, Q4와 별개))</w:t>
       </w:r>
     </w:p>
     <w:p>
       <w:pPr>
-        <w:spacing w:after="160"/>
+        <w:spacing w:after="40" w:before="0" w:line="240" w:lineRule="auto"/>
       </w:pPr>
       <w:r>
         <w:rPr>
           <w:rFonts w:ascii="Malgun Gothic" w:hAnsi="Malgun Gothic"/>
-          <w:sz w:val="22"/>
+          <w:sz w:val="19"/>
         </w:rPr>
         <w:t>____________________________________________________________</w:t>
       </w:r>
     </w:p>
     <w:p>
       <w:pPr>
-        <w:spacing w:after="160"/>
+        <w:spacing w:after="40" w:before="0" w:line="240" w:lineRule="auto"/>
       </w:pPr>
       <w:r>
         <w:rPr>
           <w:rFonts w:ascii="Malgun Gothic" w:hAnsi="Malgun Gothic"/>
-          <w:sz w:val="22"/>
+          <w:sz w:val="19"/>
         </w:rPr>
         <w:t>____________________________________________________________</w:t>
       </w:r>
     </w:p>
     <w:p>
+      <w:pPr>
+        <w:spacing w:after="40" w:before="0" w:line="240" w:lineRule="auto"/>
+      </w:pPr>
       <w:r>
         <w:rPr>
           <w:rFonts w:ascii="Malgun Gothic" w:hAnsi="Malgun Gothic"/>
           <w:b/>
-          <w:sz w:val="21"/>
+          <w:sz w:val="19"/>
         </w:rPr>
         <w:t>Q17. 예산 승인자</w:t>
       </w:r>
     </w:p>
     <w:p>
+      <w:pPr>
+        <w:spacing w:after="40" w:before="0" w:line="240" w:lineRule="auto"/>
+      </w:pPr>
       <w:r>
         <w:rPr>
           <w:rFonts w:ascii="Malgun Gothic" w:hAnsi="Malgun Gothic"/>
           <w:color w:val="555A60"/>
-          <w:sz w:val="17"/>
+          <w:sz w:val="15"/>
         </w:rPr>
         <w:t>(파일럿 예산 최종 승인 직책 (실명 대신 직책만))</w:t>
       </w:r>
     </w:p>
     <w:p>
       <w:pPr>
-        <w:spacing w:after="160"/>
+        <w:spacing w:after="40" w:before="0" w:line="240" w:lineRule="auto"/>
       </w:pPr>
       <w:r>
         <w:rPr>
           <w:rFonts w:ascii="Malgun Gothic" w:hAnsi="Malgun Gothic"/>
-          <w:sz w:val="22"/>
+          <w:sz w:val="19"/>
         </w:rPr>
         <w:t>____________________________________________________________</w:t>
       </w:r>
     </w:p>
     <w:p>
+      <w:pPr>
+        <w:spacing w:after="40" w:before="0" w:line="240" w:lineRule="auto"/>
+      </w:pPr>
       <w:r>
         <w:rPr>
           <w:rFonts w:ascii="Malgun Gothic" w:hAnsi="Malgun Gothic"/>
           <w:color w:val="555A60"/>
-          <w:sz w:val="18"/>
+          <w:sz w:val="16"/>
         </w:rPr>
         <w:br/>
         <w:t>본 질문지는 견적·일정 확정 전 진단 자료로만 사용됩니다. 가격은 시장 검증 전 자사 가격 가설이며 실제 계약·매출 주장이 아닙니다. 조직별 사용정책·검토체계, 개인정보·저작권·조달 관련 사항은 고객별 확인과 전문 법률·계약 검토가 필요합니다.</w:t>
       </w:r>
     </w:p>
     <w:sectPr>
-      <w:pgSz w:w="12240" w:h="15840"/>
+      <w:pgSz w:w="11906" w:h="16838"/>
       <w:pgMar w:top="720" w:right="864" w:bottom="720" w:left="864" w:header="720" w:footer="720" w:gutter="0"/>
       <w:cols w:space="720"/>
       <w:docGrid w:linePitch="360"/>
@@ -1407,9 +1521,12 @@
     <w:name w:val="Normal"/>
     <w:qFormat/>
     <w:rsid w:val="00FC693F"/>
+    <w:pPr>
+      <w:spacing w:after="40" w:before="0" w:line="240" w:lineRule="auto"/>
+    </w:pPr>
     <w:rPr>
       <w:rFonts w:ascii="Malgun Gothic" w:hAnsi="Malgun Gothic"/>
-      <w:sz w:val="21"/>
+      <w:sz w:val="19"/>
     </w:rPr>
   </w:style>
   <w:style w:type="paragraph" w:styleId="Header">

</xml_diff>